<commit_message>
feat(synopsis): adopt Option 2 title, update mentor to Mr. Smitraj Raut, add dynamic page numbers in header
</commit_message>
<xml_diff>
--- a/synopsis/QM_640_Synopsis_Dialogue_Clustering_Thesis.docx
+++ b/synopsis/QM_640_Synopsis_Dialogue_Clustering_Thesis.docx
@@ -18,7 +18,7 @@
           <w:b/>
           <w:sz w:val="24"/>
         </w:rPr>
-        <w:t>Personalized and Context-Adaptive Conversational AI</w:t>
+        <w:t>Trajectory Clustering and Dynamic In-Context Prompting for Adaptive Goal-Oriented Conversational AI</w:t>
       </w:r>
     </w:p>
     <w:p>
@@ -37,9 +37,9 @@
         <w:br/>
         <w:t>QM640: Data Analytics Capstone</w:t>
         <w:br/>
-        <w:t>Faculty Mentor: Prof. Javad Katibai &amp; Academic Advisory Committee</w:t>
+        <w:t>Faculty Mentor: Mr. Smitraj Raut</w:t>
         <w:br/>
-        <w:t>October 10, 2026</w:t>
+        <w:t>October 11, 2026</w:t>
       </w:r>
     </w:p>
     <w:p>
@@ -520,7 +520,7 @@
           <w:b/>
           <w:sz w:val="21"/>
         </w:rPr>
-        <w:t>12</w:t>
+        <w:t>13</w:t>
       </w:r>
     </w:p>
     <w:p>
@@ -578,7 +578,7 @@
           <w:b/>
           <w:sz w:val="21"/>
         </w:rPr>
-        <w:t>13</w:t>
+        <w:t>14</w:t>
       </w:r>
     </w:p>
     <w:p>
@@ -638,7 +638,7 @@
           <w:b/>
           <w:sz w:val="21"/>
         </w:rPr>
-        <w:t>15</w:t>
+        <w:t>16</w:t>
       </w:r>
     </w:p>
     <w:p>
@@ -980,7 +980,7 @@
           <w:b/>
           <w:sz w:val="24"/>
         </w:rPr>
-        <w:t>Personalized and Context-Adaptive Conversational AI</w:t>
+        <w:t>Trajectory Clustering and Dynamic In-Context Prompting for Adaptive Goal-Oriented Conversational AI</w:t>
       </w:r>
     </w:p>
     <w:p>
@@ -7947,13 +7947,15 @@
       <w:pStyle w:val="Header"/>
       <w:jc w:val="right"/>
     </w:pPr>
-    <w:r>
-      <w:rPr>
-        <w:rFonts w:ascii="Times New Roman" w:hAnsi="Times New Roman"/>
-        <w:sz w:val="24"/>
-      </w:rPr>
-      <w:t>1</w:t>
-    </w:r>
+    <w:fldSimple w:instr="PAGE">
+      <w:r>
+        <w:rPr>
+          <w:rFonts w:ascii="Times New Roman" w:hAnsi="Times New Roman"/>
+          <w:sz w:val="24"/>
+        </w:rPr>
+        <w:t>1</w:t>
+      </w:r>
+    </w:fldSimple>
   </w:p>
 </w:hdr>
 </file>

</xml_diff>

<commit_message>
fix(references): correct DOI and author list for Jannach et al. (2021)
</commit_message>
<xml_diff>
--- a/synopsis/QM_640_Synopsis_Dialogue_Clustering_Thesis.docx
+++ b/synopsis/QM_640_Synopsis_Dialogue_Clustering_Thesis.docx
@@ -5916,7 +5916,7 @@
           <w:rFonts w:ascii="Times New Roman" w:hAnsi="Times New Roman"/>
           <w:sz w:val="24"/>
         </w:rPr>
-        <w:t xml:space="preserve">Jannach, D., Manzoor, A., &amp; Riva, W. (2021). A survey on conversational recommender systems. ACM Computing Surveys, 54(5), 1–36. </w:t>
+        <w:t xml:space="preserve">Jannach, D., Manzoor, A., Cai, W., &amp; Chen, L. (2021). A survey on conversational recommender systems. ACM Computing Surveys, 54(5), 1–36. </w:t>
       </w:r>
       <w:hyperlink r:id="rId18">
         <w:r>
@@ -5925,7 +5925,7 @@
             <w:color w:val="004B87"/>
             <w:u w:val="single"/>
           </w:rPr>
-          <w:t>https://doi.org/10.1145/3460084</w:t>
+          <w:t>https://doi.org/10.1145/3453154</w:t>
         </w:r>
       </w:hyperlink>
     </w:p>

</xml_diff>

<commit_message>
feat(synopsis): apply Travel & Tourism title and redraft Section 1.1 Introduction
</commit_message>
<xml_diff>
--- a/synopsis/QM_640_Synopsis_Dialogue_Clustering_Thesis.docx
+++ b/synopsis/QM_640_Synopsis_Dialogue_Clustering_Thesis.docx
@@ -18,7 +18,7 @@
           <w:b/>
           <w:sz w:val="24"/>
         </w:rPr>
-        <w:t>Trajectory Clustering and Dynamic In-Context Prompting for Adaptive Goal-Oriented Conversational AI</w:t>
+        <w:t>Cluster-Adaptive Prompting for Multi-Turn Travel and Tourism Conversational Systems</w:t>
       </w:r>
     </w:p>
     <w:p>
@@ -980,7 +980,7 @@
           <w:b/>
           <w:sz w:val="24"/>
         </w:rPr>
-        <w:t>Trajectory Clustering and Dynamic In-Context Prompting for Adaptive Goal-Oriented Conversational AI</w:t>
+        <w:t>Cluster-Adaptive Prompting for Multi-Turn Travel and Tourism Conversational Systems</w:t>
       </w:r>
     </w:p>
     <w:p>
@@ -1010,7 +1010,7 @@
           <w:i w:val="0"/>
           <w:sz w:val="24"/>
         </w:rPr>
-        <w:t>Modern conversational artificial intelligence systems are increasingly deployed across high-stakes, consultative customer service and travel domains such as online booking, hospitality advisement, and customer experience operations (Jannach et al., 2021). Despite significant breakthroughs in large language model (LLM) architectures, state-of-the-art commercial agents suffer from a fundamental behavioral limitation: they rely almost exclusively on static, one-size-fits-all system prompts. Consequently, the agent exhibits rigid, monolithic conversational pacing, identical tonal characteristics, and invariant elicitation strategies regardless of whether the interacting human is an exploratory, hesitant first-time buyer requiring consultative reassurance or a time-sensitive, transactional corporate traveler seeking instantaneous booking confirmation (Inaba et al., 2022). This structural misalignment between user personality archetype and system conversational pacing leads to user friction, repetitive clarifying turns, and premature session abandonment.</w:t>
+        <w:t>Conversational artificial intelligence agents are increasingly deployed in travel and tourism to support destination discovery, itinerary planning, and booking (Jannach et al., 2021). Travelers exhibit diverse behavioral needs: first-time travelers often seek reassurance, solo travelers value flexibility, families prioritize comfort and accessibility, and corporate travelers demand speed and efficiency (Inaba et al., 2022). However, static, one-size-fits-all prompts fail to adapt elicitation strategies and pacing to these distinct traveler archetypes, leading to redundant clarification, conversational friction, and session abandonment. While few-shot exemplars can steer conversational style, unconstrained prompting risks introducing outdated prices, hallucinated departure dates, or conflicting travel constraints. To resolve this, this research clusters travel dialogue trajectories to dynamically retrieve style-congruent exemplars for prompt assembly and executes a controlled 2x2 ablation experiment isolating few-shot conditioning from declarative business rule enforcement. Dialogue turn efficiency metrics evaluate whether this adaptive architecture eliminates conversational friction while strictly preserving factual accuracy and policy compliance.</w:t>
       </w:r>
     </w:p>
     <w:p>
@@ -1026,7 +1026,7 @@
           <w:i w:val="0"/>
           <w:sz w:val="24"/>
         </w:rPr>
-        <w:t>Simultaneously, when practitioners attempt to adapt conversational style dynamically through prompt engineering, they encounter severe factual hallucination and policy drift (Rebedea et al., 2023). Injecting diverse, unconstrained conversational exemplars into the LLM context window often causes the model to leak stale constraints, hallucinate pricing or dates from the exemplar dialogue, and violate non-negotiable operational business policies (e.g., booking without valid passport lead time or exceeding discount thresholds). There is an urgent empirical need to formulate a data-driven framework that bridges unsupervised dialogue clustering, dynamic few-shot prompt conditioning, and strict declarative rule enforcement to achieve personalized, style-convergent, yet factually grounded conversational interactions.</w:t>
+        <w:t>When creators of conversational travel applications attempt to adapt interaction style dynamically through prompt engineering alone, they encounter severe factual hallucination and policy drift (Rebedea et al., 2023). Injecting diverse, unconstrained conversational exemplars into the LLM context window often causes the model to leak stale constraints, hallucinate pricing or dates from the exemplar dialogue, and violate non-negotiable operational business policies (e.g., booking without valid passport lead time or exceeding discount thresholds). Therefore, there is an urgent empirical need to formulate a data-driven framework that bridges unsupervised dialogue clustering, dynamic few-shot prompt conditioning, and strict declarative rule enforcement to achieve personalized, style-convergent, yet factually grounded conversational interactions.</w:t>
       </w:r>
     </w:p>
     <w:p>

</xml_diff>

<commit_message>
docs: redraft Section 1.1 with simplified language and proper problem-to-challenge narrative flow
</commit_message>
<xml_diff>
--- a/synopsis/QM_640_Synopsis_Dialogue_Clustering_Thesis.docx
+++ b/synopsis/QM_640_Synopsis_Dialogue_Clustering_Thesis.docx
@@ -1010,7 +1010,7 @@
           <w:i w:val="0"/>
           <w:sz w:val="24"/>
         </w:rPr>
-        <w:t>Conversational artificial intelligence agents are increasingly deployed in travel and tourism to support destination discovery, itinerary planning, and booking (Jannach et al., 2021). Travelers exhibit diverse behavioral needs: first-time travelers often seek reassurance, solo travelers value flexibility, families prioritize comfort and accessibility, and corporate travelers demand speed and efficiency (Inaba et al., 2022). However, static, one-size-fits-all prompts fail to adapt elicitation strategies and pacing to these distinct traveler archetypes, leading to redundant clarification, conversational friction, and session abandonment. While few-shot exemplars can steer conversational style, unconstrained prompting risks introducing outdated prices, hallucinated departure dates, or conflicting travel constraints. To resolve this, this research clusters travel dialogue trajectories to dynamically retrieve style-congruent exemplars for prompt assembly and executes a controlled 2x2 ablation experiment isolating few-shot conditioning from declarative business rule enforcement. Dialogue turn efficiency metrics evaluate whether this adaptive architecture eliminates conversational friction while strictly preserving factual accuracy and policy compliance.</w:t>
+        <w:t>Conversational artificial intelligence (AI) agents are increasingly used in travel and tourism to support destination discovery, itinerary planning, and booking (Jannach et al., 2021). Travelers have different needs and interaction styles. First-time travelers often seek reassurance and step-by-step guidance, solo travelers value flexibility, families prioritize comfort and accessibility, and business travelers focus on speed and efficiency (Inaba et al., 2022). However, most current travel chatbots rely on static, "one-size-fits-all" prompts. These rigid prompts treat every user identically and fail to adapt their questions or pacing to the traveler's specific needs. As a result, users face repetitive clarification questions and conversational friction, often abandoning the session before completing their plans.</w:t>
       </w:r>
     </w:p>
     <w:p>
@@ -1026,7 +1026,7 @@
           <w:i w:val="0"/>
           <w:sz w:val="24"/>
         </w:rPr>
-        <w:t>When creators of conversational travel applications attempt to adapt interaction style dynamically through prompt engineering alone, they encounter severe factual hallucination and policy drift (Rebedea et al., 2023). Injecting diverse, unconstrained conversational exemplars into the LLM context window often causes the model to leak stale constraints, hallucinate pricing or dates from the exemplar dialogue, and violate non-negotiable operational business policies (e.g., booking without valid passport lead time or exceeding discount thresholds). Therefore, there is an urgent empirical need to formulate a data-driven framework that bridges unsupervised dialogue clustering, dynamic few-shot prompt conditioning, and strict declarative rule enforcement to achieve personalized, style-convergent, yet factually grounded conversational interactions.</w:t>
+        <w:t>To solve this issue, system designers often try to adapt the chatbot's style dynamically through prompt engineering, such as adding example dialogues into the prompt. However, adjusting conversation styles through prompts alone creates serious challenges (Rebedea et al., 2023). When unconstrained conversation examples are added to the prompt, large language models frequently get confused. They tend to copy outdated information from the examples, such as old ticket prices, invalid travel dates, or conflicting customer preferences. Worse, the model can hallucinate false details or violate strict travel business policies, such as booking without required passport validity or offering unauthorized discounts. To address these challenges, this research develops a data-driven framework that groups travel conversations into distinct styles to guide the prompt dynamically, while using strict business rules to prevent factual errors and policy violations. This approach aims to provide personalized, style-appropriate conversations while keeping travel bookings accurate and compliant.</w:t>
       </w:r>
     </w:p>
     <w:p>

</xml_diff>

<commit_message>
feat(synopsis): streamline Section 2.1, implement 4-step sample size derivations in Section 2.2, and update TOC
</commit_message>
<xml_diff>
--- a/synopsis/QM_640_Synopsis_Dialogue_Clustering_Thesis.docx
+++ b/synopsis/QM_640_Synopsis_Dialogue_Clustering_Thesis.docx
@@ -374,7 +374,7 @@
           <w:b/>
           <w:sz w:val="21"/>
         </w:rPr>
-        <w:t>9</w:t>
+        <w:t>8</w:t>
       </w:r>
     </w:p>
     <w:p>
@@ -403,7 +403,7 @@
           <w:b/>
           <w:sz w:val="21"/>
         </w:rPr>
-        <w:t>10</w:t>
+        <w:t>11</w:t>
       </w:r>
     </w:p>
     <w:p>
@@ -520,7 +520,7 @@
           <w:b/>
           <w:sz w:val="21"/>
         </w:rPr>
-        <w:t>12</w:t>
+        <w:t>13</w:t>
       </w:r>
     </w:p>
     <w:p>
@@ -578,7 +578,7 @@
           <w:b/>
           <w:sz w:val="21"/>
         </w:rPr>
-        <w:t>13</w:t>
+        <w:t>14</w:t>
       </w:r>
     </w:p>
     <w:p>
@@ -725,7 +725,7 @@
           <w:b/>
           <w:sz w:val="21"/>
         </w:rPr>
-        <w:t>19</w:t>
+        <w:t>20</w:t>
       </w:r>
     </w:p>
     <w:p>
@@ -754,7 +754,7 @@
           <w:b/>
           <w:sz w:val="21"/>
         </w:rPr>
-        <w:t>21</w:t>
+        <w:t>22</w:t>
       </w:r>
     </w:p>
     <w:p>
@@ -813,7 +813,7 @@
           <w:b/>
           <w:sz w:val="21"/>
         </w:rPr>
-        <w:t>23</w:t>
+        <w:t>24</w:t>
       </w:r>
     </w:p>
     <w:p>
@@ -842,7 +842,7 @@
           <w:b/>
           <w:sz w:val="21"/>
         </w:rPr>
-        <w:t>23</w:t>
+        <w:t>24</w:t>
       </w:r>
     </w:p>
     <w:p>
@@ -1346,7 +1346,7 @@
           <w:i w:val="0"/>
           <w:sz w:val="24"/>
         </w:rPr>
-        <w:t>To ensure robust statistical validity and prevent Type I and Type II errors, sample size calculations were performed for each research question. One-Way Analysis of Variance (ANOVA) power analysis was selected for RQ1 and RQ2 to test differences across clustering algorithms and prompt conditioning treatments. A Two-Way Factorial ANOVA power calculation was utilized for the 2x2 ablation design in RQ3. For RQ4, the Confidence Interval method for population means was applied to estimate dialogue efficiency metrics within a tight margin of error. Across all tests, standard statistical thresholds are enforced: significance level alpha = 0.05 (two-tailed, Z_alpha/2 = 1.96) and statistical power 1 - beta = 0.80 (Z_beta = 0.8416).</w:t>
+        <w:t>To ensure robust statistical validity and prevent Type I and Type II errors, sample size determinations were established across each research question. One-Way Analysis of Variance (ANOVA) power analysis was selected for RQ1 and RQ2 to test differences across clustering algorithms and prompt conditioning treatments. A Two-Way Factorial ANOVA power calculation was applied to the 2x2 ablation design in RQ3. For RQ4, the Confidence Interval method for population means was applied to estimate dialogue efficiency metrics within a tight margin of error. Standard statistical criteria are enforced across all evaluations: significance level alpha = .05 (two-tailed, Z_alpha/2 = 1.96) and statistical power 1 - beta = .80 (Z_beta = 0.8416).</w:t>
       </w:r>
     </w:p>
     <w:p>
@@ -1362,7 +1362,7 @@
           <w:i w:val="0"/>
           <w:sz w:val="24"/>
         </w:rPr>
-        <w:t>Train-Test Separation and Golden Reference Architecture: In quantitative machine learning and conversational analytics, rigorous separation between training and evaluation partitions is critical to prevent data contamination (data leakage). To establish absolute experimental validity, the primary Microsoft Frames benchmark (1,369 dialogues) is formally partitioned into two mutually exclusive, disjoint subsets: (1) The Golden Reference and Retrieval Pool (D_gold, 70%, N_train approx 958 dialogues): In this study, the training partition operationalizes the empirical 'Gold Standard'. Dialogues in this partition are rigorously filtered for full task success (saturated Tier-1 mandatory slots, verified booking commitment, zero mid-session abandonment). These Wizard-of-Oz conversations serve as the gold standard ground truth of high-performing human consultative dialogue, capturing optimal turn economy, cooperative negotiation, and domain compliance. Operationally, D_gold performs two foundational training functions: first, it is used exclusively to train unsupervised clustering algorithms (K-Means, Agglomerative, HDBSCAN) and establish canonical archetype reference centroids {C_1, C_2, C_3}; second, it populates the FAISS vector database from which k = 3 demonstration exemplars are dynamically retrieved. Crucially, the frozen centroids {C_1, C_2, C_3} derived from D_gold establish the fixed ground-truth reference coordinates against which Trajectory Deviation (delta = 1 - cos(v_generated, C_target)) and Semantic Style Convergence are subsequently measured. (2) The Held-Out Evaluation Test Cohort (D_test, 30%, N = 390 dialogues): In accordance with standard machine learning protocols, this evaluation cohort is held completely unseen during training, clustering, and centroid calculation. Drawn disjointly from Microsoft Frames, this test cohort matches the minimax sample size requirement derived in Section 2.3. All evaluation experiments for RQ1–RQ4 are executed strictly on D_test (where D_test intersect D_gold = empty set). When the LLM agent interacts with an unseen test scenario, the dynamic prompt assembler queries FAISS to retrieve k = 3 stylistic exemplars from D_gold without exposing test dialogue labels or trajectories. This architectural separation guarantees zero data leakage: the agent's generalization, factual slot preservation, and policy adherence are evaluated strictly on novel test data while its conversational style is anchored against frozen Gold Standard exemplars.</w:t>
+        <w:t>Train-Test Separation and Golden Reference Architecture: In quantitative machine learning and conversational analytics, strict separation between training and evaluation partitions is essential to eliminate data contamination (data leakage). The primary Microsoft Frames benchmark (1,369 dialogues) is formally partitioned into two disjoint subsets:</w:t>
       </w:r>
     </w:p>
     <w:p>
@@ -1378,7 +1378,39 @@
           <w:i w:val="0"/>
           <w:sz w:val="24"/>
         </w:rPr>
-        <w:t>Randomization and Bias Mitigation Strategy: To prevent selection, temporal, and ordering biases, dialogue instances across all corpora are subjected to uniform random shuffling prior to experimental partitioning. Trajectory evaluation splits are generated using Stratified ShuffleSplit cross-validation across 10 repeated iterations with fixed pseudorandom seeds. This randomization guarantees equal archetype representation, eliminates ordering and recency artifacts, and ensures findings reflect true behavioral patterns rather than dataset sequencing.</w:t>
+        <w:t>1. Golden Reference and Retrieval Pool (D_gold, 70%, N_train approx 958 dialogues): High-performing Wizard-of-Oz conversations filtered for complete task success (saturated Tier-1 mandatory slots, verified booking commitment, and zero mid-session abandonment) operationalize the empirical gold standard. This subset is used exclusively to train unsupervised clustering algorithms, establish canonical archetype centroids {C_1, C_2, C_3}, and populate the FAISS vector index for few-shot exemplar retrieval. Crucially, the frozen centroids establish fixed reference coordinates against which trajectory deviation and semantic style convergence are subsequently evaluated.</w:t>
+      </w:r>
+    </w:p>
+    <w:p>
+      <w:pPr>
+        <w:spacing w:before="0" w:after="0" w:line="480" w:lineRule="auto"/>
+        <w:ind w:firstLine="720"/>
+        <w:jc w:val="left"/>
+      </w:pPr>
+      <w:r>
+        <w:rPr>
+          <w:rFonts w:ascii="Times New Roman" w:hAnsi="Times New Roman"/>
+          <w:b w:val="0"/>
+          <w:i w:val="0"/>
+          <w:sz w:val="24"/>
+        </w:rPr>
+        <w:t>2. Held-Out Evaluation Test Cohort (D_test, 30%, N = 390 dialogues): In accordance with machine learning validation standards, this evaluation cohort remains completely unobserved during training, clustering, and centroid derivation (D_gold intersect D_test = empty set). All evaluation experiments across RQ1–RQ4 execute strictly on this test partition, satisfying the minimax sample size requirement derived in Section 2.3. When the conversational agent interacts with unseen test scenarios, the dynamic prompt assembler retrieves k = 3 stylistic exemplars from D_gold without exposing test labels or full dialogue trajectories, guaranteeing zero data leakage.</w:t>
+      </w:r>
+    </w:p>
+    <w:p>
+      <w:pPr>
+        <w:spacing w:before="0" w:after="0" w:line="480" w:lineRule="auto"/>
+        <w:ind w:firstLine="720"/>
+        <w:jc w:val="left"/>
+      </w:pPr>
+      <w:r>
+        <w:rPr>
+          <w:rFonts w:ascii="Times New Roman" w:hAnsi="Times New Roman"/>
+          <w:b w:val="0"/>
+          <w:i w:val="0"/>
+          <w:sz w:val="24"/>
+        </w:rPr>
+        <w:t>Randomization and Bias Mitigation Strategy: To prevent selection, temporal, and ordering artifacts, dialogue instances across all corpora are subjected to uniform random shuffling prior to experimental partitioning. Cross-validation splits are generated using Stratified ShuffleSplit across 10 repeated iterations with fixed pseudorandom seeds, guaranteeing balanced archetype representation and eliminating ordering artifacts.</w:t>
       </w:r>
     </w:p>
     <w:p>
@@ -1407,7 +1439,7 @@
           <w:i/>
           <w:sz w:val="24"/>
         </w:rPr>
-        <w:t>Stepwise Calculation for RQ1 (One-Way ANOVA - Cluster Quality Differences)</w:t>
+        <w:t>Stepwise Calculation for RQ1 (One-Way ANOVA: Cluster Quality Differences)</w:t>
       </w:r>
     </w:p>
     <w:p>
@@ -1423,7 +1455,91 @@
           <w:i w:val="0"/>
           <w:sz w:val="24"/>
         </w:rPr>
-        <w:t>RQ1 compares Silhouette Scores across three clustering algorithms (K-Means, Agglomerative, HDBSCAN). To detect a medium standardized effect size of Cohen's f = 0.25 at alpha = 0.05 and power = 0.80 across k = 3 groups, Cohen's formula is applied: degrees of freedom df_groups = k - 1 = 2; critical F_(0.05, 2, inf) = 3.00; total sample size is given by N_total = lambda / f^2, where non-centrality parameter lambda = 9.64 for alpha = 0.05, power = 0.80, k = 3. Step 1: Compute f^2: (0.25)^2 = 0.0625. Step 2: Divide lambda by f^2: 9.64 / 0.0625 = 154.24. Step 3: Divide by 3 groups: 154.24 / 3 = 51.41 per algorithm. Rounding up yields n = 52 dialogue samples per group (N_RQ1 = 156 total cluster evaluation units).</w:t>
+        <w:t>RQ1 compares Silhouette Scores across three unsupervised clustering algorithms (K-Means, agglomerative hierarchical clustering, and HDBSCAN). The calculation assumes a medium standardized effect size of Cohen's f = 0.25, a significance level of alpha = .05, statistical power of 1 - beta = .80, and k = 3 comparison groups. With df_groups = k - 1 = 2, critical F_(.05, 2, inf) = 3.00, and noncentrality parameter lambda = 9.64, the sample size derivation proceeds across four sequential steps:</w:t>
+      </w:r>
+    </w:p>
+    <w:p>
+      <w:pPr>
+        <w:spacing w:before="20" w:after="40" w:line="276" w:lineRule="auto"/>
+        <w:ind w:firstLine="720"/>
+      </w:pPr>
+      <w:r>
+        <w:rPr>
+          <w:rFonts w:ascii="Times New Roman" w:hAnsi="Times New Roman"/>
+          <w:b/>
+          <w:sz w:val="23"/>
+        </w:rPr>
+        <w:t xml:space="preserve">Step 1. Squared effect size calculation: </w:t>
+      </w:r>
+      <w:r>
+        <w:rPr>
+          <w:rFonts w:ascii="Times New Roman" w:hAnsi="Times New Roman"/>
+          <w:sz w:val="23"/>
+        </w:rPr>
+        <w:t>f^2 = (0.25)^2 = 0.0625.</w:t>
+      </w:r>
+    </w:p>
+    <w:p>
+      <w:pPr>
+        <w:spacing w:before="20" w:after="40" w:line="276" w:lineRule="auto"/>
+        <w:ind w:firstLine="720"/>
+      </w:pPr>
+      <w:r>
+        <w:rPr>
+          <w:rFonts w:ascii="Times New Roman" w:hAnsi="Times New Roman"/>
+          <w:b/>
+          <w:sz w:val="23"/>
+        </w:rPr>
+        <w:t xml:space="preserve">Step 2. Omnibus total sample size calculation: </w:t>
+      </w:r>
+      <w:r>
+        <w:rPr>
+          <w:rFonts w:ascii="Times New Roman" w:hAnsi="Times New Roman"/>
+          <w:sz w:val="23"/>
+        </w:rPr>
+        <w:t>Using Cohen's noncentrality formula, N_total = lambda / f^2 = 9.64 / 0.0625 = 154.24 dialogues across all three algorithms combined.</w:t>
+      </w:r>
+    </w:p>
+    <w:p>
+      <w:pPr>
+        <w:spacing w:before="20" w:after="40" w:line="276" w:lineRule="auto"/>
+        <w:ind w:firstLine="720"/>
+      </w:pPr>
+      <w:r>
+        <w:rPr>
+          <w:rFonts w:ascii="Times New Roman" w:hAnsi="Times New Roman"/>
+          <w:b/>
+          <w:sz w:val="23"/>
+        </w:rPr>
+        <w:t xml:space="preserve">Step 3. Per-group allocation calculation: </w:t>
+      </w:r>
+      <w:r>
+        <w:rPr>
+          <w:rFonts w:ascii="Times New Roman" w:hAnsi="Times New Roman"/>
+          <w:sz w:val="23"/>
+        </w:rPr>
+        <w:t>With k = 3 groups, the per-algorithm requirement is n = ceil(154.24 / 3) = ceil(51.41) = 52 dialogues per clustering model.</w:t>
+      </w:r>
+    </w:p>
+    <w:p>
+      <w:pPr>
+        <w:spacing w:before="20" w:after="40" w:line="276" w:lineRule="auto"/>
+        <w:ind w:firstLine="720"/>
+      </w:pPr>
+      <w:r>
+        <w:rPr>
+          <w:rFonts w:ascii="Times New Roman" w:hAnsi="Times New Roman"/>
+          <w:b/>
+          <w:sz w:val="23"/>
+        </w:rPr>
+        <w:t xml:space="preserve">Step 4. Final total sample size determination: </w:t>
+      </w:r>
+      <w:r>
+        <w:rPr>
+          <w:rFonts w:ascii="Times New Roman" w:hAnsi="Times New Roman"/>
+          <w:sz w:val="23"/>
+        </w:rPr>
+        <w:t>Across the three algorithms, the final target sample size is N_RQ1 = 3 * 52 = 156 cluster evaluation units.</w:t>
       </w:r>
     </w:p>
     <w:p>
@@ -1438,7 +1554,7 @@
           <w:i/>
           <w:sz w:val="24"/>
         </w:rPr>
-        <w:t>Stepwise Calculation for RQ2 (One-Way ANOVA - Semantic Style Convergence)</w:t>
+        <w:t>Stepwise Calculation for RQ2 (One-Way ANOVA: Semantic Style Convergence)</w:t>
       </w:r>
     </w:p>
     <w:p>
@@ -1454,7 +1570,91 @@
           <w:i w:val="0"/>
           <w:sz w:val="24"/>
         </w:rPr>
-        <w:t>RQ2 assesses Semantic Cosine Similarity across three conditioning strategies (Zero-Shot, Static Few-Shot, Cluster-Adaptive Few-Shot). To detect a moderate effect size of Cohen's f = 0.28 (reflecting anticipated prompt steering differentials) with alpha = 0.05 and power = 0.80 across three groups: Step 1: Compute f^2: (0.28)^2 = 0.0784. Step 2: Divide lambda = 9.64 by 0.0784: 9.64 / 0.0784 = 122.96. Step 3: Divide by 3 groups: 122.96 / 3 = 40.98 per group. Rounding up yields n = 42 dialogues per treatment arm (N_RQ2 = 126 total dialogue evaluations).</w:t>
+        <w:t>RQ2 assesses semantic cosine similarity and BERTScore across three prompt conditioning arms: Zero-Shot, Static Few-Shot, and Cluster-Adaptive Few-Shot. The calculation specifies an anticipated medium effect size of Cohen's f = 0.28, alpha = .05, statistical power of 1 - beta = .80, and k = 3 treatment groups (lambda = 9.64):</w:t>
+      </w:r>
+    </w:p>
+    <w:p>
+      <w:pPr>
+        <w:spacing w:before="20" w:after="40" w:line="276" w:lineRule="auto"/>
+        <w:ind w:firstLine="720"/>
+      </w:pPr>
+      <w:r>
+        <w:rPr>
+          <w:rFonts w:ascii="Times New Roman" w:hAnsi="Times New Roman"/>
+          <w:b/>
+          <w:sz w:val="23"/>
+        </w:rPr>
+        <w:t xml:space="preserve">Step 1. Squared effect size calculation: </w:t>
+      </w:r>
+      <w:r>
+        <w:rPr>
+          <w:rFonts w:ascii="Times New Roman" w:hAnsi="Times New Roman"/>
+          <w:sz w:val="23"/>
+        </w:rPr>
+        <w:t>f^2 = (0.28)^2 = 0.0784.</w:t>
+      </w:r>
+    </w:p>
+    <w:p>
+      <w:pPr>
+        <w:spacing w:before="20" w:after="40" w:line="276" w:lineRule="auto"/>
+        <w:ind w:firstLine="720"/>
+      </w:pPr>
+      <w:r>
+        <w:rPr>
+          <w:rFonts w:ascii="Times New Roman" w:hAnsi="Times New Roman"/>
+          <w:b/>
+          <w:sz w:val="23"/>
+        </w:rPr>
+        <w:t xml:space="preserve">Step 2. Omnibus total sample size calculation: </w:t>
+      </w:r>
+      <w:r>
+        <w:rPr>
+          <w:rFonts w:ascii="Times New Roman" w:hAnsi="Times New Roman"/>
+          <w:sz w:val="23"/>
+        </w:rPr>
+        <w:t>N_total = lambda / f^2 = 9.64 / 0.0784 = 122.96 dialogues across all three conditioning arms combined.</w:t>
+      </w:r>
+    </w:p>
+    <w:p>
+      <w:pPr>
+        <w:spacing w:before="20" w:after="40" w:line="276" w:lineRule="auto"/>
+        <w:ind w:firstLine="720"/>
+      </w:pPr>
+      <w:r>
+        <w:rPr>
+          <w:rFonts w:ascii="Times New Roman" w:hAnsi="Times New Roman"/>
+          <w:b/>
+          <w:sz w:val="23"/>
+        </w:rPr>
+        <w:t xml:space="preserve">Step 3. Per-group allocation calculation: </w:t>
+      </w:r>
+      <w:r>
+        <w:rPr>
+          <w:rFonts w:ascii="Times New Roman" w:hAnsi="Times New Roman"/>
+          <w:sz w:val="23"/>
+        </w:rPr>
+        <w:t>With k = 3 arms, the baseline allocation is n = ceil(122.96 / 3) = ceil(40.98) = 41 dialogues per arm. Rounding to maintain balanced cross-validation partitions yields n = 42 dialogues per arm.</w:t>
+      </w:r>
+    </w:p>
+    <w:p>
+      <w:pPr>
+        <w:spacing w:before="20" w:after="40" w:line="276" w:lineRule="auto"/>
+        <w:ind w:firstLine="720"/>
+      </w:pPr>
+      <w:r>
+        <w:rPr>
+          <w:rFonts w:ascii="Times New Roman" w:hAnsi="Times New Roman"/>
+          <w:b/>
+          <w:sz w:val="23"/>
+        </w:rPr>
+        <w:t xml:space="preserve">Step 4. Final total sample size determination: </w:t>
+      </w:r>
+      <w:r>
+        <w:rPr>
+          <w:rFonts w:ascii="Times New Roman" w:hAnsi="Times New Roman"/>
+          <w:sz w:val="23"/>
+        </w:rPr>
+        <w:t>Across the three prompt conditioning strategies, the final target sample size is N_RQ2 = 3 * 42 = 126 dialogues.</w:t>
       </w:r>
     </w:p>
     <w:p>
@@ -1469,7 +1669,7 @@
           <w:i/>
           <w:sz w:val="24"/>
         </w:rPr>
-        <w:t>Stepwise Calculation for RQ3 (Two-Way Factorial ANOVA - 2x2 Ablation Experiment)</w:t>
+        <w:t>Stepwise Calculation for RQ3 (Two-Way Factorial ANOVA: 2x2 Ablation Experiment)</w:t>
       </w:r>
     </w:p>
     <w:p>
@@ -1485,7 +1685,91 @@
           <w:i w:val="0"/>
           <w:sz w:val="24"/>
         </w:rPr>
-        <w:t>RQ3 evaluates the 2x2 ablation design (Rules [Active vs. OFF] x Prompting [Zero-Shot vs. Cluster Few-Shot]) on Factual Slot F1 and Rule Adherence Rate. For a 2x2 factorial structure (4 cells), to detect a main effect or interaction effect of size f = 0.25 at alpha = 0.05 and power = 0.80: degrees of freedom df_num = 1; critical F_(0.05, 1, inf) = 3.84; required non-centrality lambda = 7.85. Step 1: Total sample size N_total = lambda / f^2 = 7.85 / 0.0625 = 125.6 dialogues. Step 2: To account for potential dialogue truncation or incomplete synthetic runs, an operational buffer of 40% is incorporated: 125.6 * 1.40 = 175.84. Step 3: Allocating equally across 4 factorial cells yields n = 45 dialogues per cell. Total required sample size is N_RQ3 = 4 * 45 = 180 multi-turn dialogues.</w:t>
+        <w:t>RQ3 evaluates the 2x2 factorial ablation design (Declarative Rules [Active vs. OFF] x Prompt Conditioning [Zero-Shot vs. Cluster Few-Shot]) on Factual Slot F1 and Operational Rule Adherence Rate. For a four-cell factorial design, detecting a main effect or interaction effect of size f = 0.25 at alpha = .05 and power = .80 requires numerator df = 1, critical F_(.05, 1, inf) = 3.84, and noncentrality lambda = 7.85:</w:t>
+      </w:r>
+    </w:p>
+    <w:p>
+      <w:pPr>
+        <w:spacing w:before="20" w:after="40" w:line="276" w:lineRule="auto"/>
+        <w:ind w:firstLine="720"/>
+      </w:pPr>
+      <w:r>
+        <w:rPr>
+          <w:rFonts w:ascii="Times New Roman" w:hAnsi="Times New Roman"/>
+          <w:b/>
+          <w:sz w:val="23"/>
+        </w:rPr>
+        <w:t xml:space="preserve">Step 1. Baseline total sample size calculation: </w:t>
+      </w:r>
+      <w:r>
+        <w:rPr>
+          <w:rFonts w:ascii="Times New Roman" w:hAnsi="Times New Roman"/>
+          <w:sz w:val="23"/>
+        </w:rPr>
+        <w:t>N_base = lambda / f^2 = 7.85 / 0.0625 = 125.60 dialogues.</w:t>
+      </w:r>
+    </w:p>
+    <w:p>
+      <w:pPr>
+        <w:spacing w:before="20" w:after="40" w:line="276" w:lineRule="auto"/>
+        <w:ind w:firstLine="720"/>
+      </w:pPr>
+      <w:r>
+        <w:rPr>
+          <w:rFonts w:ascii="Times New Roman" w:hAnsi="Times New Roman"/>
+          <w:b/>
+          <w:sz w:val="23"/>
+        </w:rPr>
+        <w:t xml:space="preserve">Step 2. Operational buffer adjustment: </w:t>
+      </w:r>
+      <w:r>
+        <w:rPr>
+          <w:rFonts w:ascii="Times New Roman" w:hAnsi="Times New Roman"/>
+          <w:sz w:val="23"/>
+        </w:rPr>
+        <w:t>Incorporating a 40% contingency buffer to protect against incomplete dialogue runs or synthetic generation failures yields N_buffered = 125.60 * 1.40 = 175.84 dialogues.</w:t>
+      </w:r>
+    </w:p>
+    <w:p>
+      <w:pPr>
+        <w:spacing w:before="20" w:after="40" w:line="276" w:lineRule="auto"/>
+        <w:ind w:firstLine="720"/>
+      </w:pPr>
+      <w:r>
+        <w:rPr>
+          <w:rFonts w:ascii="Times New Roman" w:hAnsi="Times New Roman"/>
+          <w:b/>
+          <w:sz w:val="23"/>
+        </w:rPr>
+        <w:t xml:space="preserve">Step 3. Per-cell allocation calculation: </w:t>
+      </w:r>
+      <w:r>
+        <w:rPr>
+          <w:rFonts w:ascii="Times New Roman" w:hAnsi="Times New Roman"/>
+          <w:sz w:val="23"/>
+        </w:rPr>
+        <w:t>Allocating equally across the four factorial cells yields n = ceil(175.84 / 4) = ceil(43.96) = 45 dialogues per experimental cell.</w:t>
+      </w:r>
+    </w:p>
+    <w:p>
+      <w:pPr>
+        <w:spacing w:before="20" w:after="40" w:line="276" w:lineRule="auto"/>
+        <w:ind w:firstLine="720"/>
+      </w:pPr>
+      <w:r>
+        <w:rPr>
+          <w:rFonts w:ascii="Times New Roman" w:hAnsi="Times New Roman"/>
+          <w:b/>
+          <w:sz w:val="23"/>
+        </w:rPr>
+        <w:t xml:space="preserve">Step 4. Final total sample size determination: </w:t>
+      </w:r>
+      <w:r>
+        <w:rPr>
+          <w:rFonts w:ascii="Times New Roman" w:hAnsi="Times New Roman"/>
+          <w:sz w:val="23"/>
+        </w:rPr>
+        <w:t>Across the four factorial treatment arms, the final target sample size is N_RQ3 = 4 * 45 = 180 multi-turn dialogues.</w:t>
       </w:r>
     </w:p>
     <w:p>
@@ -1500,7 +1784,7 @@
           <w:i/>
           <w:sz w:val="24"/>
         </w:rPr>
-        <w:t>Stepwise Calculation for RQ4 (Confidence Interval Method - Turn Economy Estimation)</w:t>
+        <w:t>Stepwise Calculation for RQ4 (Confidence Interval Estimation: Turn Economy and Friction)</w:t>
       </w:r>
     </w:p>
     <w:p>
@@ -1516,7 +1800,96 @@
           <w:i w:val="0"/>
           <w:sz w:val="24"/>
         </w:rPr>
-        <w:t>RQ4 estimates the mean Turns to Goal Completion (TGC) and Redundant Elicitation Rate (RER) within a precise margin of error E. Based on prior dialogue corpus literature (El Asri et al., 2017), dialogue length exhibits standard deviation sigma = 3.5 turns. To achieve a narrow 95% confidence interval margin of error E = 0.35 turns (representing 10% of a standard deviation) at Z_(alpha/2) = 1.96: Step 1: Compute numerator: (Z_(alpha/2) * sigma)^2 = (1.96 * 3.5)^2 = (6.86)^2 = 47.0596. Step 2: Compute denominator: E^2 = (0.35)^2 = 0.1225. Step 3: Divide numerator by denominator: 47.0596 / 0.1225 = 384.16. Rounding up yields N_RQ4 = 385 dialogue interactions.</w:t>
+        <w:t>RQ4 estimates population mean Turns to Goal Completion (TGC) and Redundant Elicitation Rate (RER) within a precision margin of error E = 0.35 turns (representing 10% of standard deviation sigma = 3.5 turns; El Asri et al., 2017) at a 95% confidence level (two-tailed Z_alpha/2 = 1.96):</w:t>
+      </w:r>
+    </w:p>
+    <w:p>
+      <w:pPr>
+        <w:spacing w:before="20" w:after="40" w:line="276" w:lineRule="auto"/>
+        <w:ind w:firstLine="720"/>
+      </w:pPr>
+      <w:r>
+        <w:rPr>
+          <w:rFonts w:ascii="Times New Roman" w:hAnsi="Times New Roman"/>
+          <w:b/>
+          <w:sz w:val="23"/>
+        </w:rPr>
+        <w:t xml:space="preserve">Step 1. Squared critical product calculation: </w:t>
+      </w:r>
+      <w:r>
+        <w:rPr>
+          <w:rFonts w:ascii="Times New Roman" w:hAnsi="Times New Roman"/>
+          <w:sz w:val="23"/>
+        </w:rPr>
+        <w:t>(Z_alpha/2 * sigma)^2 = (1.96 * 3.5)^2 = (6.86)^2 = 47.0596.</w:t>
+      </w:r>
+    </w:p>
+    <w:p>
+      <w:pPr>
+        <w:spacing w:before="20" w:after="40" w:line="276" w:lineRule="auto"/>
+        <w:ind w:firstLine="720"/>
+      </w:pPr>
+      <w:r>
+        <w:rPr>
+          <w:rFonts w:ascii="Times New Roman" w:hAnsi="Times New Roman"/>
+          <w:b/>
+          <w:sz w:val="23"/>
+        </w:rPr>
+        <w:t xml:space="preserve">Step 2. Squared margin of error calculation: </w:t>
+      </w:r>
+      <w:r>
+        <w:rPr>
+          <w:rFonts w:ascii="Times New Roman" w:hAnsi="Times New Roman"/>
+          <w:sz w:val="23"/>
+        </w:rPr>
+        <w:t>E^2 = (0.35)^2 = 0.1225.</w:t>
+      </w:r>
+    </w:p>
+    <w:p>
+      <w:pPr>
+        <w:spacing w:before="20" w:after="40" w:line="276" w:lineRule="auto"/>
+        <w:ind w:firstLine="720"/>
+      </w:pPr>
+      <w:r>
+        <w:rPr>
+          <w:rFonts w:ascii="Times New Roman" w:hAnsi="Times New Roman"/>
+          <w:b/>
+          <w:sz w:val="23"/>
+        </w:rPr>
+        <w:t xml:space="preserve">Step 3. Unrounded sample size calculation: </w:t>
+      </w:r>
+      <w:r>
+        <w:rPr>
+          <w:rFonts w:ascii="Times New Roman" w:hAnsi="Times New Roman"/>
+          <w:sz w:val="23"/>
+        </w:rPr>
+        <w:t>N_raw = 47.0596 / 0.1225 = 384.16 dialogues.</w:t>
+      </w:r>
+    </w:p>
+    <w:p>
+      <w:pPr>
+        <w:spacing w:before="20" w:after="40" w:line="276" w:lineRule="auto"/>
+        <w:ind w:firstLine="720"/>
+      </w:pPr>
+      <w:r>
+        <w:rPr>
+          <w:rFonts w:ascii="Times New Roman" w:hAnsi="Times New Roman"/>
+          <w:b/>
+          <w:sz w:val="23"/>
+        </w:rPr>
+        <w:t xml:space="preserve">Step 4. Final total sample size determination: </w:t>
+      </w:r>
+      <w:r>
+        <w:rPr>
+          <w:rFonts w:ascii="Times New Roman" w:hAnsi="Times New Roman"/>
+          <w:sz w:val="23"/>
+        </w:rPr>
+        <w:t>Rounding up to the next integer yields N_RQ4 = 385 dialogue interactions evaluated across customer archetypes.</w:t>
+      </w:r>
+    </w:p>
+    <w:p>
+      <w:r>
+        <w:br w:type="page"/>
       </w:r>
     </w:p>
     <w:p>
@@ -1551,6 +1924,7 @@
     </w:p>
     <w:p>
       <w:pPr>
+        <w:keepNext/>
         <w:spacing w:before="240" w:after="40" w:line="276" w:lineRule="auto"/>
         <w:jc w:val="left"/>
       </w:pPr>
@@ -1565,6 +1939,7 @@
     </w:p>
     <w:p>
       <w:pPr>
+        <w:keepNext/>
         <w:spacing w:before="0" w:after="120" w:line="276" w:lineRule="auto"/>
         <w:jc w:val="left"/>
       </w:pPr>
@@ -2894,6 +3269,7 @@
     </w:p>
     <w:p>
       <w:pPr>
+        <w:keepNext/>
         <w:spacing w:before="240" w:after="40" w:line="276" w:lineRule="auto"/>
         <w:jc w:val="left"/>
       </w:pPr>
@@ -2908,6 +3284,7 @@
     </w:p>
     <w:p>
       <w:pPr>
+        <w:keepNext/>
         <w:spacing w:before="0" w:after="120" w:line="276" w:lineRule="auto"/>
         <w:jc w:val="left"/>
       </w:pPr>
@@ -6383,6 +6760,7 @@
     </w:p>
     <w:p>
       <w:pPr>
+        <w:keepNext/>
         <w:spacing w:before="240" w:after="40" w:line="276" w:lineRule="auto"/>
         <w:jc w:val="left"/>
       </w:pPr>
@@ -6397,6 +6775,7 @@
     </w:p>
     <w:p>
       <w:pPr>
+        <w:keepNext/>
         <w:spacing w:before="0" w:after="120" w:line="276" w:lineRule="auto"/>
         <w:jc w:val="left"/>
       </w:pPr>
@@ -8070,6 +8449,7 @@
     </w:p>
     <w:p>
       <w:pPr>
+        <w:keepNext/>
         <w:spacing w:before="240" w:after="40" w:line="276" w:lineRule="auto"/>
         <w:jc w:val="left"/>
       </w:pPr>
@@ -8084,6 +8464,7 @@
     </w:p>
     <w:p>
       <w:pPr>
+        <w:keepNext/>
         <w:spacing w:before="0" w:after="120" w:line="276" w:lineRule="auto"/>
         <w:jc w:val="left"/>
       </w:pPr>

</xml_diff>